<commit_message>
Done the majority of the work required. Some of the questions were ambigous and weird to answer and comprehend. There also seemed to be some repeating and overlapping questions. But what can you do?
</commit_message>
<xml_diff>
--- a/Semester 2/Stage_1_SmartCare_v01_and_AI_Activity_Card.docx
+++ b/Semester 2/Stage_1_SmartCare_v01_and_AI_Activity_Card.docx
@@ -1,6 +1,6 @@
 
 <file path=word/document.xml><?xml version="1.0" encoding="utf-8"?>
-<w:document xmlns:wpc="http://schemas.microsoft.com/office/word/2010/wordprocessingCanvas" xmlns:cx="http://schemas.microsoft.com/office/drawing/2014/chartex" xmlns:cx1="http://schemas.microsoft.com/office/drawing/2015/9/8/chartex" xmlns:cx2="http://schemas.microsoft.com/office/drawing/2015/10/21/chartex" xmlns:cx3="http://schemas.microsoft.com/office/drawing/2016/5/9/chartex" xmlns:cx4="http://schemas.microsoft.com/office/drawing/2016/5/10/chartex" xmlns:cx5="http://schemas.microsoft.com/office/drawing/2016/5/11/chartex" xmlns:cx6="http://schemas.microsoft.com/office/drawing/2016/5/12/chartex" xmlns:cx7="http://schemas.microsoft.com/office/drawing/2016/5/13/chartex" xmlns:cx8="http://schemas.microsoft.com/office/drawing/2016/5/14/chartex" xmlns:mc="http://schemas.openxmlformats.org/markup-compatibility/2006" xmlns:aink="http://schemas.microsoft.com/office/drawing/2016/ink" xmlns:am3d="http://schemas.microsoft.com/office/drawing/2017/model3d" xmlns:o="urn:schemas-microsoft-com:office:office" xmlns:oel="http://schemas.microsoft.com/office/2019/extlst" xmlns:r="http://schemas.openxmlformats.org/officeDocument/2006/relationships" xmlns:m="http://schemas.openxmlformats.org/officeDocument/2006/math" xmlns:v="urn:schemas-microsoft-com:vml" xmlns:wp14="http://schemas.microsoft.com/office/word/2010/wordprocessingDrawing" xmlns:wp="http://schemas.openxmlformats.org/drawingml/2006/wordprocessingDrawing" xmlns:w10="urn:schemas-microsoft-com:office:word" xmlns:w="http://schemas.openxmlformats.org/wordprocessingml/2006/main" xmlns:w14="http://schemas.microsoft.com/office/word/2010/wordml" xmlns:w15="http://schemas.microsoft.com/office/word/2012/wordml" xmlns:w16cei="http://schemas.microsoft.com/office/word/2026/wordml/cei" xmlns:w16cex="http://schemas.microsoft.com/office/word/2018/wordml/cex" xmlns:w16cid="http://schemas.microsoft.com/office/word/2016/wordml/cid" xmlns:w16="http://schemas.microsoft.com/office/word/2018/wordml" xmlns:w16du="http://schemas.microsoft.com/office/word/2023/wordml/word16du" xmlns:w16sdtdh="http://schemas.microsoft.com/office/word/2020/wordml/sdtdatahash" xmlns:w16sdtfl="http://schemas.microsoft.com/office/word/2024/wordml/sdtformatlock" xmlns:w16se="http://schemas.microsoft.com/office/word/2015/wordml/symex" xmlns:wpg="http://schemas.microsoft.com/office/word/2010/wordprocessingGroup" xmlns:wpi="http://schemas.microsoft.com/office/word/2010/wordprocessingInk" xmlns:wne="http://schemas.microsoft.com/office/word/2006/wordml" xmlns:wps="http://schemas.microsoft.com/office/word/2010/wordprocessingShape" mc:Ignorable="w14 w15 w16se w16cid w16 w16cex w16sdtdh w16sdtfl w16du wp14">
+<w:document xmlns:wpc="http://schemas.microsoft.com/office/word/2010/wordprocessingCanvas" xmlns:cx="http://schemas.microsoft.com/office/drawing/2014/chartex" xmlns:cx1="http://schemas.microsoft.com/office/drawing/2015/9/8/chartex" xmlns:cx2="http://schemas.microsoft.com/office/drawing/2015/10/21/chartex" xmlns:cx3="http://schemas.microsoft.com/office/drawing/2016/5/9/chartex" xmlns:cx4="http://schemas.microsoft.com/office/drawing/2016/5/10/chartex" xmlns:cx5="http://schemas.microsoft.com/office/drawing/2016/5/11/chartex" xmlns:cx6="http://schemas.microsoft.com/office/drawing/2016/5/12/chartex" xmlns:cx7="http://schemas.microsoft.com/office/drawing/2016/5/13/chartex" xmlns:cx8="http://schemas.microsoft.com/office/drawing/2016/5/14/chartex" xmlns:mc="http://schemas.openxmlformats.org/markup-compatibility/2006" xmlns:aink="http://schemas.microsoft.com/office/drawing/2016/ink" xmlns:am3d="http://schemas.microsoft.com/office/drawing/2017/model3d" xmlns:o="urn:schemas-microsoft-com:office:office" xmlns:oel="http://schemas.microsoft.com/office/2019/extlst" xmlns:r="http://schemas.openxmlformats.org/officeDocument/2006/relationships" xmlns:m="http://schemas.openxmlformats.org/officeDocument/2006/math" xmlns:v="urn:schemas-microsoft-com:vml" xmlns:wp14="http://schemas.microsoft.com/office/word/2010/wordprocessingDrawing" xmlns:wp="http://schemas.openxmlformats.org/drawingml/2006/wordprocessingDrawing" xmlns:w10="urn:schemas-microsoft-com:office:word" xmlns:w="http://schemas.openxmlformats.org/wordprocessingml/2006/main" xmlns:w14="http://schemas.microsoft.com/office/word/2010/wordml" xmlns:w15="http://schemas.microsoft.com/office/word/2012/wordml" xmlns:w16cex="http://schemas.microsoft.com/office/word/2018/wordml/cex" xmlns:w16cid="http://schemas.microsoft.com/office/word/2016/wordml/cid" xmlns:w16="http://schemas.microsoft.com/office/word/2018/wordml" xmlns:w16du="http://schemas.microsoft.com/office/word/2023/wordml/word16du" xmlns:w16sdtdh="http://schemas.microsoft.com/office/word/2020/wordml/sdtdatahash" xmlns:w16sdtfl="http://schemas.microsoft.com/office/word/2024/wordml/sdtformatlock" xmlns:w16se="http://schemas.microsoft.com/office/word/2015/wordml/symex" xmlns:wpg="http://schemas.microsoft.com/office/word/2010/wordprocessingGroup" xmlns:wpi="http://schemas.microsoft.com/office/word/2010/wordprocessingInk" xmlns:wne="http://schemas.microsoft.com/office/word/2006/wordml" xmlns:wps="http://schemas.microsoft.com/office/word/2010/wordprocessingShape" mc:Ignorable="w14 w15 w16se w16cid w16 w16cex w16sdtdh w16sdtfl w16du wp14">
   <w:body>
     <w:p>
       <w:pPr>
@@ -16,10 +16,7 @@
         <w:jc w:val="center"/>
       </w:pPr>
       <w:r>
-        <w:t>A2 Case Study Stage 1</w:t>
-      </w:r>
-      <w:r>
-        <w:t xml:space="preserve"> student resource</w:t>
+        <w:t>A2 Case Study Stage 1 student resource</w:t>
       </w:r>
     </w:p>
     <w:p>
@@ -53,7 +50,16 @@
     </w:p>
     <w:p>
       <w:r>
-        <w:t>Write approximately 100 words.</w:t>
+        <w:t>The SmartCare Community Clinic is experiencing issues using their current patient management system. Their current system relies on the use of spreadsheets and paper records to keep track of patients and appointments.</w:t>
+      </w:r>
+      <w:r>
+        <w:t xml:space="preserve"> This creates </w:t>
+      </w:r>
+      <w:r>
+        <w:t>issues with things like tracking, verification and the possibility of losing the paper records. A manual spreadsheet also means you need someone to create and delete times, which can be a massive time sink.</w:t>
+      </w:r>
+      <w:r>
+        <w:t xml:space="preserve"> </w:t>
       </w:r>
     </w:p>
     <w:p>
@@ -101,13 +107,27 @@
           <w:tcPr>
             <w:tcW w:w="5040" w:type="dxa"/>
           </w:tcPr>
-          <w:p/>
+          <w:p>
+            <w:r>
+              <w:t>Patient</w:t>
+            </w:r>
+          </w:p>
         </w:tc>
         <w:tc>
           <w:tcPr>
             <w:tcW w:w="5040" w:type="dxa"/>
           </w:tcPr>
-          <w:p/>
+          <w:p>
+            <w:r>
+              <w:t xml:space="preserve">Create </w:t>
+            </w:r>
+            <w:r>
+              <w:t xml:space="preserve">an </w:t>
+            </w:r>
+            <w:r>
+              <w:t>appointment</w:t>
+            </w:r>
+          </w:p>
         </w:tc>
       </w:tr>
       <w:tr>
@@ -115,13 +135,27 @@
           <w:tcPr>
             <w:tcW w:w="5040" w:type="dxa"/>
           </w:tcPr>
-          <w:p/>
+          <w:p>
+            <w:r>
+              <w:t>SmartCare Community Clinic Staff Member</w:t>
+            </w:r>
+          </w:p>
         </w:tc>
         <w:tc>
           <w:tcPr>
             <w:tcW w:w="5040" w:type="dxa"/>
           </w:tcPr>
-          <w:p/>
+          <w:p>
+            <w:r>
+              <w:t xml:space="preserve">Sort </w:t>
+            </w:r>
+            <w:r>
+              <w:t>appointment</w:t>
+            </w:r>
+            <w:r>
+              <w:t>s</w:t>
+            </w:r>
+          </w:p>
         </w:tc>
       </w:tr>
       <w:tr>
@@ -129,13 +163,27 @@
           <w:tcPr>
             <w:tcW w:w="5040" w:type="dxa"/>
           </w:tcPr>
-          <w:p/>
+          <w:p>
+            <w:r>
+              <w:t>Doctor</w:t>
+            </w:r>
+          </w:p>
         </w:tc>
         <w:tc>
           <w:tcPr>
             <w:tcW w:w="5040" w:type="dxa"/>
           </w:tcPr>
-          <w:p/>
+          <w:p>
+            <w:r>
+              <w:t xml:space="preserve">View </w:t>
+            </w:r>
+            <w:r>
+              <w:t>appointment</w:t>
+            </w:r>
+            <w:r>
+              <w:t>s</w:t>
+            </w:r>
+          </w:p>
         </w:tc>
       </w:tr>
       <w:tr>
@@ -209,19 +257,49 @@
           <w:tcPr>
             <w:tcW w:w="3360" w:type="dxa"/>
           </w:tcPr>
-          <w:p/>
+          <w:p>
+            <w:r>
+              <w:t>Add appointment</w:t>
+            </w:r>
+          </w:p>
         </w:tc>
         <w:tc>
           <w:tcPr>
             <w:tcW w:w="3360" w:type="dxa"/>
           </w:tcPr>
-          <w:p/>
+          <w:p>
+            <w:r>
+              <w:t>Confirmed</w:t>
+            </w:r>
+          </w:p>
         </w:tc>
         <w:tc>
           <w:tcPr>
             <w:tcW w:w="3360" w:type="dxa"/>
           </w:tcPr>
-          <w:p/>
+          <w:p>
+            <w:pPr>
+              <w:rPr>
+                <w:b/>
+                <w:bCs/>
+              </w:rPr>
+            </w:pPr>
+            <w:r>
+              <w:t xml:space="preserve">Because you need to be able to make </w:t>
+            </w:r>
+            <w:r>
+              <w:t>appointment</w:t>
+            </w:r>
+            <w:r>
+              <w:t xml:space="preserve">s with an </w:t>
+            </w:r>
+            <w:r>
+              <w:t>appointment</w:t>
+            </w:r>
+            <w:r>
+              <w:t xml:space="preserve"> booking system</w:t>
+            </w:r>
+          </w:p>
         </w:tc>
       </w:tr>
       <w:tr>
@@ -229,19 +307,43 @@
           <w:tcPr>
             <w:tcW w:w="3360" w:type="dxa"/>
           </w:tcPr>
-          <w:p/>
+          <w:p>
+            <w:r>
+              <w:t>View appointments</w:t>
+            </w:r>
+          </w:p>
         </w:tc>
         <w:tc>
           <w:tcPr>
             <w:tcW w:w="3360" w:type="dxa"/>
           </w:tcPr>
-          <w:p/>
+          <w:p>
+            <w:r>
+              <w:t>Confirmed</w:t>
+            </w:r>
+          </w:p>
         </w:tc>
         <w:tc>
           <w:tcPr>
             <w:tcW w:w="3360" w:type="dxa"/>
           </w:tcPr>
-          <w:p/>
+          <w:p>
+            <w:r>
+              <w:t xml:space="preserve">Patients, staff members and doctors are all </w:t>
+            </w:r>
+            <w:r>
+              <w:t>likely</w:t>
+            </w:r>
+            <w:r>
+              <w:t xml:space="preserve"> to need to view </w:t>
+            </w:r>
+            <w:r>
+              <w:t>appointment</w:t>
+            </w:r>
+            <w:r>
+              <w:t>s</w:t>
+            </w:r>
+          </w:p>
         </w:tc>
       </w:tr>
       <w:tr>
@@ -249,19 +351,31 @@
           <w:tcPr>
             <w:tcW w:w="3360" w:type="dxa"/>
           </w:tcPr>
-          <w:p/>
+          <w:p>
+            <w:r>
+              <w:t>Sort appointments</w:t>
+            </w:r>
+          </w:p>
         </w:tc>
         <w:tc>
           <w:tcPr>
             <w:tcW w:w="3360" w:type="dxa"/>
           </w:tcPr>
-          <w:p/>
+          <w:p>
+            <w:r>
+              <w:t>Provisional</w:t>
+            </w:r>
+          </w:p>
         </w:tc>
         <w:tc>
           <w:tcPr>
             <w:tcW w:w="3360" w:type="dxa"/>
           </w:tcPr>
-          <w:p/>
+          <w:p>
+            <w:r>
+              <w:t>It is possible that staff members may need to sort appointments by name or doctor</w:t>
+            </w:r>
+          </w:p>
         </w:tc>
       </w:tr>
       <w:tr>
@@ -295,27 +409,28 @@
     </w:p>
     <w:p>
       <w:r>
-        <w:t>1. ______________________________________________________________</w:t>
+        <w:t>1. What functions do you need for this system to be useful to you</w:t>
       </w:r>
     </w:p>
     <w:p>
       <w:r>
-        <w:t>2. ______________________________________________________________</w:t>
+        <w:t>2. Why do you want this system to be changed</w:t>
       </w:r>
     </w:p>
     <w:p>
       <w:r>
-        <w:t>3. ______________________________________________________________</w:t>
+        <w:t>3. Why is this system’s functionality important to you</w:t>
       </w:r>
     </w:p>
     <w:p>
       <w:r>
-        <w:t>4. ______________________________________________________________</w:t>
+        <w:lastRenderedPageBreak/>
+        <w:t xml:space="preserve">4. </w:t>
       </w:r>
     </w:p>
     <w:p>
       <w:r>
-        <w:t>5. ______________________________________________________________</w:t>
+        <w:t xml:space="preserve">5. </w:t>
       </w:r>
     </w:p>
     <w:p>
@@ -328,18 +443,52 @@
     </w:p>
     <w:p>
       <w:r>
-        <w:t>1. ______________________________________________________________</w:t>
+        <w:t xml:space="preserve">1. </w:t>
+      </w:r>
+      <w:r>
+        <w:t xml:space="preserve">How are </w:t>
+      </w:r>
+      <w:r>
+        <w:t>appointment</w:t>
+      </w:r>
+      <w:r>
+        <w:t xml:space="preserve">s determined to be </w:t>
+      </w:r>
+      <w:proofErr w:type="gramStart"/>
+      <w:r>
+        <w:t>done</w:t>
+      </w:r>
+      <w:proofErr w:type="gramEnd"/>
+      <w:r>
+        <w:t>?</w:t>
       </w:r>
     </w:p>
     <w:p>
       <w:r>
-        <w:t>2. ______________________________________________________________</w:t>
+        <w:t xml:space="preserve">2. </w:t>
+      </w:r>
+      <w:r>
+        <w:t xml:space="preserve">Should </w:t>
+      </w:r>
+      <w:r>
+        <w:t>appointment</w:t>
+      </w:r>
+      <w:r>
+        <w:t>s be logged somewhere else or even deleted off the records in the first place?</w:t>
       </w:r>
     </w:p>
     <w:p>
       <w:r>
-        <w:lastRenderedPageBreak/>
-        <w:t>3. ______________________________________________________________</w:t>
+        <w:t xml:space="preserve">3. </w:t>
+      </w:r>
+      <w:r>
+        <w:t xml:space="preserve">Might there be more information that should be stored as part of the </w:t>
+      </w:r>
+      <w:r>
+        <w:t>appointment</w:t>
+      </w:r>
+      <w:r>
+        <w:t>?</w:t>
       </w:r>
     </w:p>
     <w:p>
@@ -370,6 +519,70 @@
       </w:r>
     </w:p>
     <w:p>
+      <w:r>
+        <w:t xml:space="preserve">[I don’t know where this is ‘code’ is coming </w:t>
+      </w:r>
+      <w:proofErr w:type="gramStart"/>
+      <w:r>
+        <w:t>from</w:t>
+      </w:r>
+      <w:proofErr w:type="gramEnd"/>
+      <w:r>
+        <w:t xml:space="preserve"> so I’ll use the example in the other docs]</w:t>
+      </w:r>
+    </w:p>
+    <w:p>
+      <w:r>
+        <w:t xml:space="preserve">The code has two functions, one that adds an </w:t>
+      </w:r>
+      <w:r>
+        <w:t>appointment</w:t>
+      </w:r>
+      <w:r>
+        <w:t xml:space="preserve"> to the </w:t>
+      </w:r>
+      <w:r>
+        <w:t>appointment</w:t>
+      </w:r>
+      <w:r>
+        <w:t xml:space="preserve"> list and one that displays all the current </w:t>
+      </w:r>
+      <w:r>
+        <w:t>appointment</w:t>
+      </w:r>
+      <w:r>
+        <w:t>s.</w:t>
+      </w:r>
+    </w:p>
+    <w:p>
+      <w:pPr>
+        <w:rPr>
+          <w:b/>
+          <w:bCs/>
+        </w:rPr>
+      </w:pPr>
+      <w:r>
+        <w:t xml:space="preserve">The main problems are that it does not </w:t>
+      </w:r>
+      <w:r>
+        <w:t>d</w:t>
+      </w:r>
+      <w:r>
+        <w:t xml:space="preserve">o all needed </w:t>
+      </w:r>
+      <w:r>
+        <w:t xml:space="preserve">input validation, you can’t modify bookings, bookings can overlap and </w:t>
+      </w:r>
+      <w:proofErr w:type="gramStart"/>
+      <w:r>
+        <w:t>booking</w:t>
+      </w:r>
+      <w:proofErr w:type="gramEnd"/>
+      <w:r>
+        <w:t xml:space="preserve"> currently don’t end.</w:t>
+      </w:r>
+    </w:p>
+    <w:p>
       <w:pPr>
         <w:pStyle w:val="Heading2"/>
       </w:pPr>
@@ -378,17 +591,83 @@
       </w:r>
     </w:p>
     <w:p>
+      <w:pPr>
+        <w:rPr>
+          <w:color w:val="EE0000"/>
+        </w:rPr>
+      </w:pPr>
       <w:r>
-        <w:t>Act as a tutor. Explain this code and identify potential problems. Do not provide a complete replacement. Ask me questions that help me reason about the solution.</w:t>
+        <w:rPr>
+          <w:color w:val="EE0000"/>
+        </w:rPr>
+        <w:t xml:space="preserve">Act as a tutor. Explain this code and identify potential problems. Do not provide a complete replacement. Ask me questions that help </w:t>
+      </w:r>
+      <w:proofErr w:type="gramStart"/>
+      <w:r>
+        <w:rPr>
+          <w:color w:val="EE0000"/>
+        </w:rPr>
+        <w:t>me</w:t>
+      </w:r>
+      <w:proofErr w:type="gramEnd"/>
+      <w:r>
+        <w:rPr>
+          <w:color w:val="EE0000"/>
+        </w:rPr>
+        <w:t xml:space="preserve"> reason </w:t>
+      </w:r>
+      <w:proofErr w:type="gramStart"/>
+      <w:r>
+        <w:rPr>
+          <w:color w:val="EE0000"/>
+        </w:rPr>
+        <w:t>about</w:t>
+      </w:r>
+      <w:proofErr w:type="gramEnd"/>
+      <w:r>
+        <w:rPr>
+          <w:color w:val="EE0000"/>
+        </w:rPr>
+        <w:t xml:space="preserve"> the solution.</w:t>
+      </w:r>
+    </w:p>
+    <w:p>
+      <w:r>
+        <w:t>Prompt used:</w:t>
+      </w:r>
+    </w:p>
+    <w:p>
+      <w:pPr>
+        <w:rPr>
+          <w:lang w:val="en-AU"/>
+        </w:rPr>
+      </w:pPr>
+      <w:r>
+        <w:t>“</w:t>
+      </w:r>
+      <w:r>
+        <w:br/>
+      </w:r>
+      <w:r>
+        <w:rPr>
+          <w:lang w:val="en-AU"/>
+        </w:rPr>
+        <w:t>In the code provided before, act as a tutor. Explain the code and identify potential problems. Do not provide a complete replacement. Ask me questions that help me reason about the solution.</w:t>
+      </w:r>
+      <w:r>
+        <w:br/>
+        <w:t>”</w:t>
       </w:r>
     </w:p>
     <w:p>
       <w:pPr>
         <w:pStyle w:val="Heading2"/>
       </w:pPr>
+      <w:proofErr w:type="gramStart"/>
       <w:r>
         <w:t>Evaluate</w:t>
       </w:r>
+      <w:proofErr w:type="gramEnd"/>
     </w:p>
     <w:tbl>
       <w:tblPr>
@@ -460,31 +739,51 @@
           <w:tcPr>
             <w:tcW w:w="2016" w:type="dxa"/>
           </w:tcPr>
-          <w:p/>
+          <w:p>
+            <w:r>
+              <w:t>Only one field is validated</w:t>
+            </w:r>
+          </w:p>
         </w:tc>
         <w:tc>
           <w:tcPr>
             <w:tcW w:w="2016" w:type="dxa"/>
           </w:tcPr>
-          <w:p/>
+          <w:p>
+            <w:r>
+              <w:t>Yes</w:t>
+            </w:r>
+          </w:p>
         </w:tc>
         <w:tc>
           <w:tcPr>
             <w:tcW w:w="2016" w:type="dxa"/>
           </w:tcPr>
-          <w:p/>
+          <w:p>
+            <w:r>
+              <w:t>No</w:t>
+            </w:r>
+          </w:p>
         </w:tc>
         <w:tc>
           <w:tcPr>
             <w:tcW w:w="2016" w:type="dxa"/>
           </w:tcPr>
-          <w:p/>
+          <w:p>
+            <w:r>
+              <w:t>No</w:t>
+            </w:r>
+          </w:p>
         </w:tc>
         <w:tc>
           <w:tcPr>
             <w:tcW w:w="2016" w:type="dxa"/>
           </w:tcPr>
-          <w:p/>
+          <w:p>
+            <w:r>
+              <w:t>No</w:t>
+            </w:r>
+          </w:p>
         </w:tc>
       </w:tr>
       <w:tr>
@@ -492,31 +791,51 @@
           <w:tcPr>
             <w:tcW w:w="2016" w:type="dxa"/>
           </w:tcPr>
-          <w:p/>
+          <w:p>
+            <w:r>
+              <w:t>Appointment times are strings</w:t>
+            </w:r>
+          </w:p>
         </w:tc>
         <w:tc>
           <w:tcPr>
             <w:tcW w:w="2016" w:type="dxa"/>
           </w:tcPr>
-          <w:p/>
+          <w:p>
+            <w:r>
+              <w:t>Yes</w:t>
+            </w:r>
+          </w:p>
         </w:tc>
         <w:tc>
           <w:tcPr>
             <w:tcW w:w="2016" w:type="dxa"/>
           </w:tcPr>
-          <w:p/>
+          <w:p>
+            <w:r>
+              <w:t>No</w:t>
+            </w:r>
+          </w:p>
         </w:tc>
         <w:tc>
           <w:tcPr>
             <w:tcW w:w="2016" w:type="dxa"/>
           </w:tcPr>
-          <w:p/>
+          <w:p>
+            <w:r>
+              <w:t>No</w:t>
+            </w:r>
+          </w:p>
         </w:tc>
         <w:tc>
           <w:tcPr>
             <w:tcW w:w="2016" w:type="dxa"/>
           </w:tcPr>
-          <w:p/>
+          <w:p>
+            <w:r>
+              <w:t>No</w:t>
+            </w:r>
+          </w:p>
         </w:tc>
       </w:tr>
       <w:tr>
@@ -524,31 +843,51 @@
           <w:tcPr>
             <w:tcW w:w="2016" w:type="dxa"/>
           </w:tcPr>
-          <w:p/>
+          <w:p>
+            <w:r>
+              <w:t>Duplicate and conflicting bookings</w:t>
+            </w:r>
+          </w:p>
         </w:tc>
         <w:tc>
           <w:tcPr>
             <w:tcW w:w="2016" w:type="dxa"/>
           </w:tcPr>
-          <w:p/>
+          <w:p>
+            <w:r>
+              <w:t>Yes</w:t>
+            </w:r>
+          </w:p>
         </w:tc>
         <w:tc>
           <w:tcPr>
             <w:tcW w:w="2016" w:type="dxa"/>
           </w:tcPr>
-          <w:p/>
+          <w:p>
+            <w:r>
+              <w:t>No</w:t>
+            </w:r>
+          </w:p>
         </w:tc>
         <w:tc>
           <w:tcPr>
             <w:tcW w:w="2016" w:type="dxa"/>
           </w:tcPr>
-          <w:p/>
+          <w:p>
+            <w:r>
+              <w:t>No</w:t>
+            </w:r>
+          </w:p>
         </w:tc>
         <w:tc>
           <w:tcPr>
             <w:tcW w:w="2016" w:type="dxa"/>
           </w:tcPr>
-          <w:p/>
+          <w:p>
+            <w:r>
+              <w:t>No</w:t>
+            </w:r>
+          </w:p>
         </w:tc>
       </w:tr>
       <w:tr>
@@ -556,31 +895,103 @@
           <w:tcPr>
             <w:tcW w:w="2016" w:type="dxa"/>
           </w:tcPr>
-          <w:p/>
+          <w:p>
+            <w:r>
+              <w:t>Data disappears when program stops</w:t>
+            </w:r>
+          </w:p>
         </w:tc>
         <w:tc>
           <w:tcPr>
             <w:tcW w:w="2016" w:type="dxa"/>
           </w:tcPr>
-          <w:p/>
+          <w:p>
+            <w:r>
+              <w:t>Yes</w:t>
+            </w:r>
+          </w:p>
         </w:tc>
         <w:tc>
           <w:tcPr>
             <w:tcW w:w="2016" w:type="dxa"/>
           </w:tcPr>
-          <w:p/>
+          <w:p>
+            <w:r>
+              <w:t>No</w:t>
+            </w:r>
+          </w:p>
         </w:tc>
         <w:tc>
           <w:tcPr>
             <w:tcW w:w="2016" w:type="dxa"/>
           </w:tcPr>
-          <w:p/>
+          <w:p>
+            <w:r>
+              <w:t>No</w:t>
+            </w:r>
+          </w:p>
         </w:tc>
         <w:tc>
           <w:tcPr>
             <w:tcW w:w="2016" w:type="dxa"/>
           </w:tcPr>
-          <w:p/>
+          <w:p>
+            <w:r>
+              <w:t>Yes (for now)</w:t>
+            </w:r>
+          </w:p>
+        </w:tc>
+      </w:tr>
+      <w:tr>
+        <w:tc>
+          <w:tcPr>
+            <w:tcW w:w="2016" w:type="dxa"/>
+          </w:tcPr>
+          <w:p>
+            <w:r>
+              <w:t>No way to update or remove appointments</w:t>
+            </w:r>
+          </w:p>
+        </w:tc>
+        <w:tc>
+          <w:tcPr>
+            <w:tcW w:w="2016" w:type="dxa"/>
+          </w:tcPr>
+          <w:p>
+            <w:r>
+              <w:t>Yes</w:t>
+            </w:r>
+          </w:p>
+        </w:tc>
+        <w:tc>
+          <w:tcPr>
+            <w:tcW w:w="2016" w:type="dxa"/>
+          </w:tcPr>
+          <w:p>
+            <w:r>
+              <w:t>No</w:t>
+            </w:r>
+          </w:p>
+        </w:tc>
+        <w:tc>
+          <w:tcPr>
+            <w:tcW w:w="2016" w:type="dxa"/>
+          </w:tcPr>
+          <w:p>
+            <w:r>
+              <w:t>No</w:t>
+            </w:r>
+          </w:p>
+        </w:tc>
+        <w:tc>
+          <w:tcPr>
+            <w:tcW w:w="2016" w:type="dxa"/>
+          </w:tcPr>
+          <w:p>
+            <w:r>
+              <w:t>No</w:t>
+            </w:r>
+          </w:p>
         </w:tc>
       </w:tr>
     </w:tbl>
@@ -658,12 +1069,19 @@
         <w:pStyle w:val="Heading2"/>
       </w:pPr>
       <w:r>
+        <w:lastRenderedPageBreak/>
         <w:t>Explain</w:t>
       </w:r>
     </w:p>
     <w:p>
       <w:r>
         <w:t>Can I explain the final code without reading the AI response? What do I still need to understand?</w:t>
+      </w:r>
+    </w:p>
+    <w:p/>
+    <w:p>
+      <w:r>
+        <w:t>[The above two were already done in one of the other documents.]</w:t>
       </w:r>
     </w:p>
     <w:sectPr>
@@ -677,7 +1095,7 @@
 </file>
 
 <file path=word/numbering.xml><?xml version="1.0" encoding="utf-8"?>
-<w:numbering xmlns:wpc="http://schemas.microsoft.com/office/word/2010/wordprocessingCanvas" xmlns:cx="http://schemas.microsoft.com/office/drawing/2014/chartex" xmlns:cx1="http://schemas.microsoft.com/office/drawing/2015/9/8/chartex" xmlns:cx2="http://schemas.microsoft.com/office/drawing/2015/10/21/chartex" xmlns:cx3="http://schemas.microsoft.com/office/drawing/2016/5/9/chartex" xmlns:cx4="http://schemas.microsoft.com/office/drawing/2016/5/10/chartex" xmlns:cx5="http://schemas.microsoft.com/office/drawing/2016/5/11/chartex" xmlns:cx6="http://schemas.microsoft.com/office/drawing/2016/5/12/chartex" xmlns:cx7="http://schemas.microsoft.com/office/drawing/2016/5/13/chartex" xmlns:cx8="http://schemas.microsoft.com/office/drawing/2016/5/14/chartex" xmlns:mc="http://schemas.openxmlformats.org/markup-compatibility/2006" xmlns:aink="http://schemas.microsoft.com/office/drawing/2016/ink" xmlns:am3d="http://schemas.microsoft.com/office/drawing/2017/model3d" xmlns:o="urn:schemas-microsoft-com:office:office" xmlns:oel="http://schemas.microsoft.com/office/2019/extlst" xmlns:r="http://schemas.openxmlformats.org/officeDocument/2006/relationships" xmlns:m="http://schemas.openxmlformats.org/officeDocument/2006/math" xmlns:v="urn:schemas-microsoft-com:vml" xmlns:wp14="http://schemas.microsoft.com/office/word/2010/wordprocessingDrawing" xmlns:wp="http://schemas.openxmlformats.org/drawingml/2006/wordprocessingDrawing" xmlns:w10="urn:schemas-microsoft-com:office:word" xmlns:w="http://schemas.openxmlformats.org/wordprocessingml/2006/main" xmlns:w14="http://schemas.microsoft.com/office/word/2010/wordml" xmlns:w15="http://schemas.microsoft.com/office/word/2012/wordml" xmlns:w16cei="http://schemas.microsoft.com/office/word/2026/wordml/cei" xmlns:w16cex="http://schemas.microsoft.com/office/word/2018/wordml/cex" xmlns:w16cid="http://schemas.microsoft.com/office/word/2016/wordml/cid" xmlns:w16="http://schemas.microsoft.com/office/word/2018/wordml" xmlns:w16du="http://schemas.microsoft.com/office/word/2023/wordml/word16du" xmlns:w16sdtdh="http://schemas.microsoft.com/office/word/2020/wordml/sdtdatahash" xmlns:w16sdtfl="http://schemas.microsoft.com/office/word/2024/wordml/sdtformatlock" xmlns:w16se="http://schemas.microsoft.com/office/word/2015/wordml/symex" xmlns:wpg="http://schemas.microsoft.com/office/word/2010/wordprocessingGroup" xmlns:wpi="http://schemas.microsoft.com/office/word/2010/wordprocessingInk" xmlns:wne="http://schemas.microsoft.com/office/word/2006/wordml" xmlns:wps="http://schemas.microsoft.com/office/word/2010/wordprocessingShape" mc:Ignorable="w14 w15 w16se w16cid w16 w16cex w16sdtdh w16sdtfl w16du wp14">
+<w:numbering xmlns:wpc="http://schemas.microsoft.com/office/word/2010/wordprocessingCanvas" xmlns:cx="http://schemas.microsoft.com/office/drawing/2014/chartex" xmlns:cx1="http://schemas.microsoft.com/office/drawing/2015/9/8/chartex" xmlns:cx2="http://schemas.microsoft.com/office/drawing/2015/10/21/chartex" xmlns:cx3="http://schemas.microsoft.com/office/drawing/2016/5/9/chartex" xmlns:cx4="http://schemas.microsoft.com/office/drawing/2016/5/10/chartex" xmlns:cx5="http://schemas.microsoft.com/office/drawing/2016/5/11/chartex" xmlns:cx6="http://schemas.microsoft.com/office/drawing/2016/5/12/chartex" xmlns:cx7="http://schemas.microsoft.com/office/drawing/2016/5/13/chartex" xmlns:cx8="http://schemas.microsoft.com/office/drawing/2016/5/14/chartex" xmlns:mc="http://schemas.openxmlformats.org/markup-compatibility/2006" xmlns:aink="http://schemas.microsoft.com/office/drawing/2016/ink" xmlns:am3d="http://schemas.microsoft.com/office/drawing/2017/model3d" xmlns:o="urn:schemas-microsoft-com:office:office" xmlns:oel="http://schemas.microsoft.com/office/2019/extlst" xmlns:r="http://schemas.openxmlformats.org/officeDocument/2006/relationships" xmlns:m="http://schemas.openxmlformats.org/officeDocument/2006/math" xmlns:v="urn:schemas-microsoft-com:vml" xmlns:wp14="http://schemas.microsoft.com/office/word/2010/wordprocessingDrawing" xmlns:wp="http://schemas.openxmlformats.org/drawingml/2006/wordprocessingDrawing" xmlns:w10="urn:schemas-microsoft-com:office:word" xmlns:w="http://schemas.openxmlformats.org/wordprocessingml/2006/main" xmlns:w14="http://schemas.microsoft.com/office/word/2010/wordml" xmlns:w15="http://schemas.microsoft.com/office/word/2012/wordml" xmlns:w16cex="http://schemas.microsoft.com/office/word/2018/wordml/cex" xmlns:w16cid="http://schemas.microsoft.com/office/word/2016/wordml/cid" xmlns:w16="http://schemas.microsoft.com/office/word/2018/wordml" xmlns:w16du="http://schemas.microsoft.com/office/word/2023/wordml/word16du" xmlns:w16sdtdh="http://schemas.microsoft.com/office/word/2020/wordml/sdtdatahash" xmlns:w16sdtfl="http://schemas.microsoft.com/office/word/2024/wordml/sdtformatlock" xmlns:w16se="http://schemas.microsoft.com/office/word/2015/wordml/symex" xmlns:wpg="http://schemas.microsoft.com/office/word/2010/wordprocessingGroup" xmlns:wpi="http://schemas.microsoft.com/office/word/2010/wordprocessingInk" xmlns:wne="http://schemas.microsoft.com/office/word/2006/wordml" xmlns:wps="http://schemas.microsoft.com/office/word/2010/wordprocessingShape" mc:Ignorable="w14 w15 w16se w16cid w16 w16cex w16sdtdh w16sdtfl w16du wp14">
   <w:abstractNum w:abstractNumId="0" w15:restartNumberingAfterBreak="0">
     <w:nsid w:val="FFFFFF7C"/>
     <w:multiLevelType w:val="singleLevel"/>
@@ -1486,7 +1904,6 @@
   <w:style w:type="character" w:default="1" w:styleId="DefaultParagraphFont">
     <w:name w:val="Default Paragraph Font"/>
     <w:uiPriority w:val="1"/>
-    <w:semiHidden/>
     <w:unhideWhenUsed/>
   </w:style>
   <w:style w:type="table" w:default="1" w:styleId="TableNormal">
@@ -12262,6 +12679,19 @@
         <w:shd w:val="clear" w:color="auto" w:fill="FBCAA2" w:themeFill="accent6" w:themeFillTint="7F"/>
       </w:tcPr>
     </w:tblStylePr>
+  </w:style>
+  <w:style w:type="paragraph" w:styleId="NormalWeb">
+    <w:name w:val="Normal (Web)"/>
+    <w:basedOn w:val="Normal"/>
+    <w:uiPriority w:val="99"/>
+    <w:semiHidden/>
+    <w:unhideWhenUsed/>
+    <w:rsid w:val="006D4550"/>
+    <w:rPr>
+      <w:rFonts w:ascii="Times New Roman" w:hAnsi="Times New Roman" w:cs="Times New Roman"/>
+      <w:sz w:val="24"/>
+      <w:szCs w:val="24"/>
+    </w:rPr>
   </w:style>
 </w:styles>
 </file>

</xml_diff>